<commit_message>
Fix temporal chart and cover page semantics, add test coverage
Fixes two P2 code review findings:

1. Cover page label renamed from "Data Collection Period" to
   "Content Date Range" — the timestamp span reflects when content
   was published, not when scraping ran. Avoids misleading readers
   when source content spans decades (e.g. old Amazon reviews).

2. Temporal chart now uses full corpus as percentage denominator
   (not just the dated subset). Undated items appear as a separate
   grey "Undated" bar so readers see how much data lacks timestamps.

Test coverage (122 passed, +7 new):
- 4 unit tests for generate_temporal_chart: PNG output, all-undated
  returns None, undated bar included, full-corpus denominator
- 3 integration assertions: chart_temporal.png exists, DOCX contains
  "Content Date Range", DOCX does not contain old label

All 4 showcase reports regenerated with fixes.

Co-Authored-By: Claude Opus 4.6 (1M context) <noreply@anthropic.com>
</commit_message>
<xml_diff>
--- a/examples/outcomes/make_in_india/make_in_india_report.docx
+++ b/examples/outcomes/make_in_india/make_in_india_report.docx
@@ -290,7 +290,7 @@
                 <w:color w:val="374151"/>
                 <w:sz w:val="22"/>
               </w:rPr>
-              <w:t>Data Collection Period</w:t>
+              <w:t>Content Date Range</w:t>
             </w:r>
           </w:p>
         </w:tc>
@@ -1023,7 +1023,7 @@
           <w:i w:val="0"/>
           <w:sz w:val="22"/>
         </w:rPr>
-        <w:t>The chart below shows how the analysed data is distributed across years. This illustrates the recency and concentration of the evidence base.</w:t>
+        <w:t>The chart below shows when the analysed content was originally published, based on source timestamps. Percentages are of the full corpus. Items without a source timestamp are shown separately as 'Undated'.</w:t>
       </w:r>
     </w:p>
     <w:p>
@@ -1078,7 +1078,7 @@
           <w:color w:val="6B7280"/>
           <w:sz w:val="18"/>
         </w:rPr>
-        <w:t>Figure 2: Data distribution by year</w:t>
+        <w:t>Figure 2: Content publication date by year (full corpus denominator)</w:t>
       </w:r>
     </w:p>
     <w:p>

</xml_diff>

<commit_message>
Release v0.2.0: remove engagement gates, add hair colour study
Breaking change: engagement thresholds removed from corpus admission.
Every consumer voice enters equally. Engagement preserved as scoring
metadata only. See CHANGELOG.md for full details.

- Version bump to 0.2.0 in __init__.py and pyproject.toml
- CHANGELOG.md created with full v0.2.0 and v0.1.0 entries
- All 5 study reports regenerated with updated code
- India Hair Colour study added to examples/outcomes/ (4,314 items, 21 insights)
- Hair colour brief added to examples/briefs/
- README updated with hair colour in study table

Co-Authored-By: Claude Opus 4.6 (1M context) <noreply@anthropic.com>
</commit_message>
<xml_diff>
--- a/examples/outcomes/make_in_india/make_in_india_report.docx
+++ b/examples/outcomes/make_in_india/make_in_india_report.docx
@@ -539,7 +539,7 @@
           <w:i w:val="0"/>
           <w:sz w:val="22"/>
         </w:rPr>
-        <w:t>Of 282,355 raw data points collected across all sources, 23,461 remained after deduplication and engagement filtering, and 5,814 passed LLM relevance classification (2.1% of total collected). These 5,814 items form the analysis corpus.</w:t>
+        <w:t>Of 282,355 raw data points collected across all sources, 23,461 remained after deduplication and quality filtering, and 5,814 passed LLM relevance classification (2.1% of total collected). These 5,814 items form the analysis corpus.</w:t>
       </w:r>
     </w:p>
     <w:tbl>
@@ -660,7 +660,7 @@
           </w:tcPr>
           <w:p>
             <w:r>
-              <w:t>After deduplication &amp; engagement filter</w:t>
+              <w:t>After deduplication &amp; quality filter</w:t>
             </w:r>
           </w:p>
         </w:tc>
@@ -680,7 +680,7 @@
           </w:tcPr>
           <w:p>
             <w:r>
-              <w:t>Thread dedup (max 5 comments/thread), min engagement filters applied per platform</w:t>
+              <w:t>Thread dedup (max 5 comments/thread, random selection), empty/short text removed</w:t>
             </w:r>
           </w:p>
         </w:tc>
@@ -2536,7 +2536,7 @@
           </w:tcPr>
           <w:p>
             <w:r>
-              <w:t>66% (Medium)</w:t>
+              <w:t>65% (Medium)</w:t>
             </w:r>
           </w:p>
         </w:tc>
@@ -2660,7 +2660,7 @@
           </w:tcPr>
           <w:p>
             <w:r>
-              <w:t>68% (Medium)</w:t>
+              <w:t>67% (Medium)</w:t>
             </w:r>
           </w:p>
         </w:tc>
@@ -2784,7 +2784,7 @@
           </w:tcPr>
           <w:p>
             <w:r>
-              <w:t>61% (Medium)</w:t>
+              <w:t>60% (Medium)</w:t>
             </w:r>
           </w:p>
         </w:tc>
@@ -3032,7 +3032,7 @@
           </w:tcPr>
           <w:p>
             <w:r>
-              <w:t>61% (Medium)</w:t>
+              <w:t>60% (Medium)</w:t>
             </w:r>
           </w:p>
         </w:tc>
@@ -3094,7 +3094,7 @@
           </w:tcPr>
           <w:p>
             <w:r>
-              <w:t>61% (Medium)</w:t>
+              <w:t>60% (Medium)</w:t>
             </w:r>
           </w:p>
         </w:tc>
@@ -3218,7 +3218,7 @@
           </w:tcPr>
           <w:p>
             <w:r>
-              <w:t>66% (Medium)</w:t>
+              <w:t>65% (Medium)</w:t>
             </w:r>
           </w:p>
         </w:tc>
@@ -3404,7 +3404,7 @@
           </w:tcPr>
           <w:p>
             <w:r>
-              <w:t>66% (Medium)</w:t>
+              <w:t>65% (Medium)</w:t>
             </w:r>
           </w:p>
         </w:tc>
@@ -4254,7 +4254,7 @@
           <w:color w:val="D97706"/>
           <w:sz w:val="18"/>
         </w:rPr>
-        <w:t>68% (Medium)</w:t>
+        <w:t>67% (Medium)</w:t>
       </w:r>
       <w:r>
         <w:rPr>
@@ -4603,7 +4603,7 @@
           <w:color w:val="D97706"/>
           <w:sz w:val="18"/>
         </w:rPr>
-        <w:t>68% (Medium)</w:t>
+        <w:t>67% (Medium)</w:t>
       </w:r>
       <w:r>
         <w:rPr>
@@ -5327,7 +5327,7 @@
           <w:color w:val="D97706"/>
           <w:sz w:val="18"/>
         </w:rPr>
-        <w:t>66% (Medium)</w:t>
+        <w:t>65% (Medium)</w:t>
       </w:r>
       <w:r>
         <w:rPr>
@@ -5676,7 +5676,7 @@
           <w:color w:val="D97706"/>
           <w:sz w:val="18"/>
         </w:rPr>
-        <w:t>66% (Medium)</w:t>
+        <w:t>65% (Medium)</w:t>
       </w:r>
       <w:r>
         <w:rPr>
@@ -7874,7 +7874,7 @@
           <w:color w:val="D97706"/>
           <w:sz w:val="18"/>
         </w:rPr>
-        <w:t>63% (Medium)</w:t>
+        <w:t>62% (Medium)</w:t>
       </w:r>
       <w:r>
         <w:rPr>
@@ -8223,7 +8223,7 @@
           <w:color w:val="D97706"/>
           <w:sz w:val="18"/>
         </w:rPr>
-        <w:t>63% (Medium)</w:t>
+        <w:t>62% (Medium)</w:t>
       </w:r>
       <w:r>
         <w:rPr>
@@ -8572,7 +8572,7 @@
           <w:color w:val="D97706"/>
           <w:sz w:val="18"/>
         </w:rPr>
-        <w:t>61% (Medium)</w:t>
+        <w:t>60% (Medium)</w:t>
       </w:r>
       <w:r>
         <w:rPr>
@@ -8921,7 +8921,7 @@
           <w:color w:val="D97706"/>
           <w:sz w:val="18"/>
         </w:rPr>
-        <w:t>61% (Medium)</w:t>
+        <w:t>60% (Medium)</w:t>
       </w:r>
       <w:r>
         <w:rPr>

</xml_diff>

<commit_message>
Re-run Make in India study with narrative review and synthesis skills
Narrative review: 149 items reassigned to existing themes (unthemed 5.8% -> 1.6%)
Synthesis: fresh context window produces deeper insights with exact sentiment
counts, explanatory frameworks, and specific recommendations
Score-report regenerated with updated scoring sort order

Co-Authored-By: Claude Opus 4.6 (1M context) <noreply@anthropic.com>
</commit_message>
<xml_diff>
--- a/examples/outcomes/make_in_india/make_in_india_report.docx
+++ b/examples/outcomes/make_in_india/make_in_india_report.docx
@@ -404,7 +404,7 @@
           <w:i w:val="0"/>
           <w:sz w:val="22"/>
         </w:rPr>
-        <w:t>Of 0 raw data points collected across all sources, 22,860 remained after deduplication and quality filtering, and 3,516 passed LLM relevance classification (0.0% of total collected). These 3,516 items form the analysis corpus.</w:t>
+        <w:t>Of 282,355 raw data points collected across all sources, 22,860 remained after deduplication and quality filtering, and 3,516 passed LLM relevance classification (1.2% of total collected). These 3,516 items form the analysis corpus.</w:t>
       </w:r>
     </w:p>
     <w:tbl>
@@ -525,7 +525,7 @@
                 <w:color w:val="374151"/>
                 <w:sz w:val="20"/>
               </w:rPr>
-              <w:t>0</w:t>
+              <w:t>282,355</w:t>
             </w:r>
           </w:p>
         </w:tc>
@@ -676,7 +676,7 @@
                 <w:color w:val="374151"/>
                 <w:sz w:val="20"/>
               </w:rPr>
-              <w:t>LLM relevance filter — 0.0% of raw collected. Analysis corpus.</w:t>
+              <w:t>LLM relevance filter — 1.2% of raw collected. Analysis corpus.</w:t>
             </w:r>
           </w:p>
         </w:tc>
@@ -1203,7 +1203,21 @@
           <w:i w:val="0"/>
           <w:sz w:val="22"/>
         </w:rPr>
-        <w:t>Data was collected using automated scrapers with engagement-weighted filtering applied per platform. Thread-level deduplication caps comments per thread to prevent over-indexing vocal threads. All items passed an LLM relevance classification step before analysis.</w:t>
+        <w:t>Data was ingested from externally collected sources. The original collection methodology, sampling strategy, and any platform-specific filtering applied prior to ingestion are not documented in this pipeline and should be considered unknown.</w:t>
+      </w:r>
+    </w:p>
+    <w:p>
+      <w:pPr>
+        <w:spacing w:after="120" w:before="0"/>
+      </w:pPr>
+      <w:r>
+        <w:rPr>
+          <w:rFonts w:ascii="Lato" w:hAnsi="Lato"/>
+          <w:b w:val="0"/>
+          <w:i w:val="0"/>
+          <w:sz w:val="22"/>
+        </w:rPr>
+        <w:t>Thread-level deduplication caps comments per thread (max 5, randomly selected) to prevent over-indexing vocal threads. Engagement metrics are preserved as metadata for signal strength scoring but do not gate corpus admission. All items passed an LLM relevance classification step before analysis.</w:t>
       </w:r>
     </w:p>
     <w:p>
@@ -3576,7 +3590,7 @@
                 <w:color w:val="374151"/>
                 <w:sz w:val="20"/>
               </w:rPr>
-              <w:t>1756</w:t>
+              <w:t>1802</w:t>
             </w:r>
           </w:p>
         </w:tc>
@@ -3597,7 +3611,7 @@
                 <w:color w:val="374151"/>
                 <w:sz w:val="20"/>
               </w:rPr>
-              <w:t>49.9%</w:t>
+              <w:t>51.3%</w:t>
             </w:r>
           </w:p>
         </w:tc>
@@ -3704,7 +3718,7 @@
                 <w:color w:val="374151"/>
                 <w:sz w:val="20"/>
               </w:rPr>
-              <w:t>1128</w:t>
+              <w:t>1151</w:t>
             </w:r>
           </w:p>
         </w:tc>
@@ -3725,7 +3739,7 @@
                 <w:color w:val="374151"/>
                 <w:sz w:val="20"/>
               </w:rPr>
-              <w:t>32.1%</w:t>
+              <w:t>32.7%</w:t>
             </w:r>
           </w:p>
         </w:tc>
@@ -3746,7 +3760,7 @@
                 <w:color w:val="374151"/>
                 <w:sz w:val="20"/>
               </w:rPr>
-              <w:t>66% (Moderate)</w:t>
+              <w:t>64% (Moderate)</w:t>
             </w:r>
           </w:p>
         </w:tc>
@@ -3832,7 +3846,7 @@
                 <w:color w:val="374151"/>
                 <w:sz w:val="20"/>
               </w:rPr>
-              <w:t>1017</w:t>
+              <w:t>1034</w:t>
             </w:r>
           </w:p>
         </w:tc>
@@ -3853,7 +3867,7 @@
                 <w:color w:val="374151"/>
                 <w:sz w:val="20"/>
               </w:rPr>
-              <w:t>28.9%</w:t>
+              <w:t>29.4%</w:t>
             </w:r>
           </w:p>
         </w:tc>
@@ -3960,7 +3974,7 @@
                 <w:color w:val="374151"/>
                 <w:sz w:val="20"/>
               </w:rPr>
-              <w:t>738</w:t>
+              <w:t>775</w:t>
             </w:r>
           </w:p>
         </w:tc>
@@ -3981,7 +3995,7 @@
                 <w:color w:val="374151"/>
                 <w:sz w:val="20"/>
               </w:rPr>
-              <w:t>21.0%</w:t>
+              <w:t>22.0%</w:t>
             </w:r>
           </w:p>
         </w:tc>
@@ -4002,7 +4016,7 @@
                 <w:color w:val="374151"/>
                 <w:sz w:val="20"/>
               </w:rPr>
-              <w:t>62% (Moderate)</w:t>
+              <w:t>60% (Moderate)</w:t>
             </w:r>
           </w:p>
         </w:tc>
@@ -4023,7 +4037,7 @@
                 <w:color w:val="374151"/>
                 <w:sz w:val="20"/>
               </w:rPr>
-              <w:t>65% (Medium)</w:t>
+              <w:t>64% (Medium)</w:t>
             </w:r>
           </w:p>
         </w:tc>
@@ -4088,7 +4102,7 @@
                 <w:color w:val="374151"/>
                 <w:sz w:val="20"/>
               </w:rPr>
-              <w:t>657</w:t>
+              <w:t>670</w:t>
             </w:r>
           </w:p>
         </w:tc>
@@ -4109,7 +4123,7 @@
                 <w:color w:val="374151"/>
                 <w:sz w:val="20"/>
               </w:rPr>
-              <w:t>18.7%</w:t>
+              <w:t>19.1%</w:t>
             </w:r>
           </w:p>
         </w:tc>
@@ -4151,7 +4165,7 @@
                 <w:color w:val="374151"/>
                 <w:sz w:val="20"/>
               </w:rPr>
-              <w:t>60% (Medium)</w:t>
+              <w:t>61% (Medium)</w:t>
             </w:r>
           </w:p>
         </w:tc>
@@ -4216,7 +4230,7 @@
                 <w:color w:val="374151"/>
                 <w:sz w:val="20"/>
               </w:rPr>
-              <w:t>562</w:t>
+              <w:t>572</w:t>
             </w:r>
           </w:p>
         </w:tc>
@@ -4237,7 +4251,7 @@
                 <w:color w:val="374151"/>
                 <w:sz w:val="20"/>
               </w:rPr>
-              <w:t>16.0%</w:t>
+              <w:t>16.3%</w:t>
             </w:r>
           </w:p>
         </w:tc>
@@ -4258,7 +4272,7 @@
                 <w:color w:val="374151"/>
                 <w:sz w:val="20"/>
               </w:rPr>
-              <w:t>52% (Moderate)</w:t>
+              <w:t>53% (Moderate)</w:t>
             </w:r>
           </w:p>
         </w:tc>
@@ -4279,7 +4293,7 @@
                 <w:color w:val="374151"/>
                 <w:sz w:val="20"/>
               </w:rPr>
-              <w:t>62% (Medium)</w:t>
+              <w:t>61% (Medium)</w:t>
             </w:r>
           </w:p>
         </w:tc>
@@ -4344,7 +4358,7 @@
                 <w:color w:val="374151"/>
                 <w:sz w:val="20"/>
               </w:rPr>
-              <w:t>509</w:t>
+              <w:t>528</w:t>
             </w:r>
           </w:p>
         </w:tc>
@@ -4365,7 +4379,7 @@
                 <w:color w:val="374151"/>
                 <w:sz w:val="20"/>
               </w:rPr>
-              <w:t>14.5%</w:t>
+              <w:t>15.0%</w:t>
             </w:r>
           </w:p>
         </w:tc>
@@ -4472,7 +4486,7 @@
                 <w:color w:val="374151"/>
                 <w:sz w:val="20"/>
               </w:rPr>
-              <w:t>439</w:t>
+              <w:t>444</w:t>
             </w:r>
           </w:p>
         </w:tc>
@@ -4493,7 +4507,7 @@
                 <w:color w:val="374151"/>
                 <w:sz w:val="20"/>
               </w:rPr>
-              <w:t>12.5%</w:t>
+              <w:t>12.6%</w:t>
             </w:r>
           </w:p>
         </w:tc>
@@ -4600,7 +4614,7 @@
                 <w:color w:val="374151"/>
                 <w:sz w:val="20"/>
               </w:rPr>
-              <w:t>416</w:t>
+              <w:t>422</w:t>
             </w:r>
           </w:p>
         </w:tc>
@@ -4621,7 +4635,7 @@
                 <w:color w:val="374151"/>
                 <w:sz w:val="20"/>
               </w:rPr>
-              <w:t>11.8%</w:t>
+              <w:t>12.0%</w:t>
             </w:r>
           </w:p>
         </w:tc>
@@ -4728,7 +4742,7 @@
                 <w:color w:val="374151"/>
                 <w:sz w:val="20"/>
               </w:rPr>
-              <w:t>379</w:t>
+              <w:t>385</w:t>
             </w:r>
           </w:p>
         </w:tc>
@@ -4749,7 +4763,7 @@
                 <w:color w:val="374151"/>
                 <w:sz w:val="20"/>
               </w:rPr>
-              <w:t>10.8%</w:t>
+              <w:t>10.9%</w:t>
             </w:r>
           </w:p>
         </w:tc>
@@ -4791,7 +4805,7 @@
                 <w:color w:val="374151"/>
                 <w:sz w:val="20"/>
               </w:rPr>
-              <w:t>61% (Medium)</w:t>
+              <w:t>60% (Medium)</w:t>
             </w:r>
           </w:p>
         </w:tc>
@@ -4856,7 +4870,7 @@
                 <w:color w:val="374151"/>
                 <w:sz w:val="20"/>
               </w:rPr>
-              <w:t>313</w:t>
+              <w:t>327</w:t>
             </w:r>
           </w:p>
         </w:tc>
@@ -4877,7 +4891,7 @@
                 <w:color w:val="374151"/>
                 <w:sz w:val="20"/>
               </w:rPr>
-              <w:t>8.9%</w:t>
+              <w:t>9.3%</w:t>
             </w:r>
           </w:p>
         </w:tc>
@@ -4984,7 +4998,7 @@
                 <w:color w:val="374151"/>
                 <w:sz w:val="20"/>
               </w:rPr>
-              <w:t>250</w:t>
+              <w:t>263</w:t>
             </w:r>
           </w:p>
         </w:tc>
@@ -5005,7 +5019,7 @@
                 <w:color w:val="374151"/>
                 <w:sz w:val="20"/>
               </w:rPr>
-              <w:t>7.1%</w:t>
+              <w:t>7.5%</w:t>
             </w:r>
           </w:p>
         </w:tc>
@@ -5026,7 +5040,7 @@
                 <w:color w:val="374151"/>
                 <w:sz w:val="20"/>
               </w:rPr>
-              <w:t>51% (Moderate)</w:t>
+              <w:t>57% (Moderate)</w:t>
             </w:r>
           </w:p>
         </w:tc>
@@ -5240,7 +5254,7 @@
           <w:color w:val="6B7280"/>
           <w:sz w:val="18"/>
         </w:rPr>
-        <w:t xml:space="preserve">  |  49.9% of Dataset</w:t>
+        <w:t xml:space="preserve">  |  51.3% of Dataset</w:t>
       </w:r>
       <w:r>
         <w:rPr>
@@ -5631,7 +5645,7 @@
           <w:color w:val="374151"/>
           <w:sz w:val="18"/>
         </w:rPr>
-        <w:t>66% (Moderate)</w:t>
+        <w:t>64% (Moderate)</w:t>
       </w:r>
       <w:r>
         <w:rPr>
@@ -5641,7 +5655,7 @@
           <w:color w:val="6B7280"/>
           <w:sz w:val="18"/>
         </w:rPr>
-        <w:t xml:space="preserve">  |  32.1% of Dataset</w:t>
+        <w:t xml:space="preserve">  |  32.7% of Dataset</w:t>
       </w:r>
       <w:r>
         <w:rPr>
@@ -6048,7 +6062,7 @@
           <w:color w:val="6B7280"/>
           <w:sz w:val="18"/>
         </w:rPr>
-        <w:t xml:space="preserve">  |  28.9% of Dataset</w:t>
+        <w:t xml:space="preserve">  |  29.4% of Dataset</w:t>
       </w:r>
       <w:r>
         <w:rPr>
@@ -6419,7 +6433,7 @@
           <w:color w:val="D97706"/>
           <w:sz w:val="18"/>
         </w:rPr>
-        <w:t>65% (Medium)</w:t>
+        <w:t>64% (Medium)</w:t>
       </w:r>
       <w:r>
         <w:rPr>
@@ -6439,7 +6453,7 @@
           <w:color w:val="374151"/>
           <w:sz w:val="18"/>
         </w:rPr>
-        <w:t>62% (Moderate)</w:t>
+        <w:t>60% (Moderate)</w:t>
       </w:r>
       <w:r>
         <w:rPr>
@@ -6449,7 +6463,7 @@
           <w:color w:val="6B7280"/>
           <w:sz w:val="18"/>
         </w:rPr>
-        <w:t xml:space="preserve">  |  21.0% of Dataset</w:t>
+        <w:t xml:space="preserve">  |  22.0% of Dataset</w:t>
       </w:r>
       <w:r>
         <w:rPr>
@@ -6850,7 +6864,7 @@
           <w:color w:val="6B7280"/>
           <w:sz w:val="18"/>
         </w:rPr>
-        <w:t xml:space="preserve">  |  14.5% of Dataset</w:t>
+        <w:t xml:space="preserve">  |  15.0% of Dataset</w:t>
       </w:r>
       <w:r>
         <w:rPr>
@@ -7227,7 +7241,7 @@
           <w:color w:val="D97706"/>
           <w:sz w:val="18"/>
         </w:rPr>
-        <w:t>62% (Medium)</w:t>
+        <w:t>61% (Medium)</w:t>
       </w:r>
       <w:r>
         <w:rPr>
@@ -7247,7 +7261,7 @@
           <w:color w:val="374151"/>
           <w:sz w:val="18"/>
         </w:rPr>
-        <w:t>52% (Moderate)</w:t>
+        <w:t>53% (Moderate)</w:t>
       </w:r>
       <w:r>
         <w:rPr>
@@ -7257,7 +7271,7 @@
           <w:color w:val="6B7280"/>
           <w:sz w:val="18"/>
         </w:rPr>
-        <w:t xml:space="preserve">  |  16.0% of Dataset</w:t>
+        <w:t xml:space="preserve">  |  16.3% of Dataset</w:t>
       </w:r>
       <w:r>
         <w:rPr>
@@ -7664,7 +7678,7 @@
           <w:color w:val="6B7280"/>
           <w:sz w:val="18"/>
         </w:rPr>
-        <w:t xml:space="preserve">  |  12.5% of Dataset</w:t>
+        <w:t xml:space="preserve">  |  12.6% of Dataset</w:t>
       </w:r>
       <w:r>
         <w:rPr>
@@ -8000,7 +8014,7 @@
           <w:color w:val="1E3A5F"/>
           <w:sz w:val="32"/>
         </w:rPr>
-        <w:t>08. Assembly vs Manufacturing: The Value-Add Question</w:t>
+        <w:t>08. Vocal for Local &amp; Swadeshi Movement</w:t>
       </w:r>
     </w:p>
     <w:p>
@@ -8015,7 +8029,7 @@
           <w:color w:val="6B7280"/>
           <w:sz w:val="18"/>
         </w:rPr>
-        <w:t>n=379</w:t>
+        <w:t>n=657</w:t>
       </w:r>
       <w:r>
         <w:rPr>
@@ -8055,7 +8069,7 @@
           <w:color w:val="374151"/>
           <w:sz w:val="18"/>
         </w:rPr>
-        <w:t>51% (Moderate)</w:t>
+        <w:t>46% (Weak)</w:t>
       </w:r>
       <w:r>
         <w:rPr>
@@ -8065,7 +8079,7 @@
           <w:color w:val="6B7280"/>
           <w:sz w:val="18"/>
         </w:rPr>
-        <w:t xml:space="preserve">  |  10.8% of Dataset</w:t>
+        <w:t xml:space="preserve">  |  19.1% of Dataset</w:t>
       </w:r>
       <w:r>
         <w:rPr>
@@ -8085,7 +8099,7 @@
           <w:color w:val="059669"/>
           <w:sz w:val="18"/>
         </w:rPr>
-        <w:t>+22%</w:t>
+        <w:t>+57%</w:t>
       </w:r>
     </w:p>
     <w:p>
@@ -8104,7 +8118,7 @@
               <a:graphicData uri="http://schemas.openxmlformats.org/drawingml/2006/picture">
                 <pic:pic>
                   <pic:nvPicPr>
-                    <pic:cNvPr id="0" name="chart_radar_INS_010.png"/>
+                    <pic:cNvPr id="0" name="chart_radar_INS_003.png"/>
                     <pic:cNvPicPr/>
                   </pic:nvPicPr>
                   <pic:blipFill>
@@ -8140,7 +8154,7 @@
           <w:color w:val="6B7280"/>
           <w:sz w:val="18"/>
         </w:rPr>
-        <w:t>Score Breakdown: Assembly vs Manufacturing: The Value-Add Question</w:t>
+        <w:t>Score Breakdown: Vocal for Local &amp; Swadeshi Movement</w:t>
       </w:r>
     </w:p>
     <w:p>
@@ -8169,7 +8183,7 @@
           <w:i w:val="0"/>
           <w:sz w:val="22"/>
         </w:rPr>
-        <w:t>The assembly vs manufacturing debate (379 items, 10.0%) has a moderate NSS of +0.22. The 'screwdriver technology' critique is persistent and specific: consumers distinguish between final assembly (putting imported components together) and genuine manufacturing (designing and producing components domestically). The iPhone is the emblematic case - 'assembled in India' using Chinese displays, chips, and batteries. Critics frame this as value capture of only 10-15%, while proponents argue it is the necessary first step on a value-chain escalator.</w:t>
+        <w:t>The Vocal for Local / Swadeshi movement theme (657 items, 17.3%) has the highest positive NSS of any theme at +0.57. Content includes PM Modi's direct appeals to buy Indian, consumer pledges during Diwali/festive seasons, brand-led campaigns (Dabur positioning against Colgate on nationalist grounds), and anti-American/anti-Chinese boycott calls tied to tariff wars and geopolitical tensions (Operation Sindoor, US tariffs). The movement spans Hindi and English content, with significant Hindi-language participation.</w:t>
       </w:r>
     </w:p>
     <w:p>
@@ -8198,7 +8212,7 @@
           <w:i w:val="0"/>
           <w:sz w:val="22"/>
         </w:rPr>
-        <w:t>The assembly-vs-manufacturing distinction has become the single most effective counter-argument against Make in India claims. It is used by opposition politicians, media critics, and economically-literate consumers to deflate any manufacturing success story. Importantly, even consumers who support Make in India are increasingly aware of this distinction, creating cognitive dissonance: they want to believe India manufactures, but they know it mostly assembles. The 'value-chain escalator' argument (assembly today leads to components tomorrow) is present but less emotionally compelling than the immediate critique.</w:t>
+        <w:t>Swadeshi sentiment has evolved from a top-down government campaign into a genuinely consumer-driven movement that activates during three triggers: festive seasons (Diwali = buy Indian), geopolitical friction (US tariffs = boycott American, Pakistan tensions = boycott Chinese), and brand authenticity scandals (discovering global brands sell inferior versions in India). The movement is no longer dependent on government promotion - it has its own consumer momentum, particularly among Hindi-speaking urban consumers.</w:t>
       </w:r>
     </w:p>
     <w:p>
@@ -8227,7 +8241,7 @@
           <w:i w:val="0"/>
           <w:sz w:val="22"/>
         </w:rPr>
-        <w:t>Every manufacturing milestone that cannot withstand the 'but is it really manufactured or just assembled?' test will face immediate narrative deflation. This creates a communications arms race where the definition of success keeps moving upward. Yesterday's win (assembly plant) is today's criticism (just assembly, not manufacturing).</w:t>
+        <w:t>There is a large, engaged consumer segment willing to pay attention to and act on 'Buy Indian' messaging, but their motivation is emotional (national pride, geopolitical anger) rather than rational (product comparison). This creates both opportunity (strong brand loyalty once earned) and risk (the same consumers will punish perceived inauthenticity - brands that claim 'Indian' but are actually assembled from Chinese components).</w:t>
       </w:r>
     </w:p>
     <w:p>
@@ -8256,7 +8270,7 @@
           <w:i w:val="0"/>
           <w:sz w:val="22"/>
         </w:rPr>
-        <w:t>Get ahead of the assembly critique by proactively publishing domestic content percentages and improvement trajectories. Instead of defending assembly as a stepping stone, show concrete milestones: 'Last year 15% domestic content, this year 25%, target 50% by 2028.' Make the value-chain escalator visible and measurable rather than theoretical.</w:t>
+        <w:t>For Indian brands: lean into origin transparency - show the factory, name the city, feature the workers. For global brands operating in India: demonstrate genuine local value creation (local R&amp;D, domestic sourcing) rather than just local assembly. Festive-season and geopolitical-trigger marketing campaigns can leverage Swadeshi sentiment, but must be backed by verifiable Indian content.</w:t>
       </w:r>
     </w:p>
     <w:p>
@@ -8285,7 +8299,7 @@
           <w:i w:val="0"/>
           <w:sz w:val="22"/>
         </w:rPr>
-        <w:t>Track domestic content percentages in key PLI-beneficiary product categories over time. Survey consumers on whether they distinguish between assembly and manufacturing, and whether trajectory data (improving domestic content %) changes their perception.</w:t>
+        <w:t>Track purchase conversion rates during Swadeshi sentiment spikes (festive seasons, geopolitical events) vs baseline periods. Measure whether stated intent to 'buy Indian' translates into actual purchase behavior change.</w:t>
       </w:r>
     </w:p>
     <w:p>
@@ -8342,7 +8356,13 @@
           <w:color w:val="374151"/>
           <w:sz w:val="20"/>
         </w:rPr>
-        <w:t>"The same as india is strong partner and friend of Taiwan and they never wan china Taiwan imarges with war we have a problem at what base you claim over Taiwan and yet if yes for you then why not india bid for his own part has pak"</w:t>
+        <w:t xml:space="preserve">"Bro if you follow </w:t>
+        <w:br/>
+        <w:t xml:space="preserve">Use Swadeshi </w:t>
+        <w:br/>
+        <w:t xml:space="preserve">Means stop making reals </w:t>
+        <w:br/>
+        <w:t>Because youtube is foreign"</w:t>
       </w:r>
       <w:r>
         <w:rPr>
@@ -8368,7 +8388,7 @@
           <w:color w:val="374151"/>
           <w:sz w:val="20"/>
         </w:rPr>
-        <w:t>"@WhitePillzONLY Our trade deficit with China and ASEAN is extremely large. Most goods exported to us from ASEAN countries are actually Chinese products; they are merely relabeled or undergo minor assembly. This practice will destroy our domestic market. We must impose tariffs on China and ASEAN."</w:t>
+        <w:t>"@FI_InvestIndia Buying Indian Products are ok and agreed, that amounts to buying local. But most of the local Kirana stores are inefficient in pricing by design ( due to the retail margins, distributor, Super stockist, C&amp;amp;F etc etc ) , and we cannot blame a common man if they hunt for bargains"</w:t>
       </w:r>
       <w:r>
         <w:rPr>
@@ -8401,7 +8421,7 @@
           <w:color w:val="1E3A5F"/>
           <w:sz w:val="32"/>
         </w:rPr>
-        <w:t>09. Vocal for Local &amp; Swadeshi Movement</w:t>
+        <w:t>09. Assembly vs Manufacturing: The Value-Add Question</w:t>
       </w:r>
     </w:p>
     <w:p>
@@ -8416,7 +8436,7 @@
           <w:color w:val="6B7280"/>
           <w:sz w:val="18"/>
         </w:rPr>
-        <w:t>n=657</w:t>
+        <w:t>n=379</w:t>
       </w:r>
       <w:r>
         <w:rPr>
@@ -8456,7 +8476,7 @@
           <w:color w:val="374151"/>
           <w:sz w:val="18"/>
         </w:rPr>
-        <w:t>46% (Weak)</w:t>
+        <w:t>51% (Moderate)</w:t>
       </w:r>
       <w:r>
         <w:rPr>
@@ -8466,7 +8486,7 @@
           <w:color w:val="6B7280"/>
           <w:sz w:val="18"/>
         </w:rPr>
-        <w:t xml:space="preserve">  |  18.7% of Dataset</w:t>
+        <w:t xml:space="preserve">  |  10.9% of Dataset</w:t>
       </w:r>
       <w:r>
         <w:rPr>
@@ -8486,7 +8506,7 @@
           <w:color w:val="059669"/>
           <w:sz w:val="18"/>
         </w:rPr>
-        <w:t>+57%</w:t>
+        <w:t>+22%</w:t>
       </w:r>
     </w:p>
     <w:p>
@@ -8505,7 +8525,7 @@
               <a:graphicData uri="http://schemas.openxmlformats.org/drawingml/2006/picture">
                 <pic:pic>
                   <pic:nvPicPr>
-                    <pic:cNvPr id="0" name="chart_radar_INS_003.png"/>
+                    <pic:cNvPr id="0" name="chart_radar_INS_010.png"/>
                     <pic:cNvPicPr/>
                   </pic:nvPicPr>
                   <pic:blipFill>
@@ -8541,7 +8561,7 @@
           <w:color w:val="6B7280"/>
           <w:sz w:val="18"/>
         </w:rPr>
-        <w:t>Score Breakdown: Vocal for Local &amp; Swadeshi Movement</w:t>
+        <w:t>Score Breakdown: Assembly vs Manufacturing: The Value-Add Question</w:t>
       </w:r>
     </w:p>
     <w:p>
@@ -8570,7 +8590,7 @@
           <w:i w:val="0"/>
           <w:sz w:val="22"/>
         </w:rPr>
-        <w:t>The Vocal for Local / Swadeshi movement theme (657 items, 17.3%) has the highest positive NSS of any theme at +0.57. Content includes PM Modi's direct appeals to buy Indian, consumer pledges during Diwali/festive seasons, brand-led campaigns (Dabur positioning against Colgate on nationalist grounds), and anti-American/anti-Chinese boycott calls tied to tariff wars and geopolitical tensions (Operation Sindoor, US tariffs). The movement spans Hindi and English content, with significant Hindi-language participation.</w:t>
+        <w:t>The assembly vs manufacturing debate (379 items, 10.0%) has a moderate NSS of +0.22. The 'screwdriver technology' critique is persistent and specific: consumers distinguish between final assembly (putting imported components together) and genuine manufacturing (designing and producing components domestically). The iPhone is the emblematic case - 'assembled in India' using Chinese displays, chips, and batteries. Critics frame this as value capture of only 10-15%, while proponents argue it is the necessary first step on a value-chain escalator.</w:t>
       </w:r>
     </w:p>
     <w:p>
@@ -8599,7 +8619,7 @@
           <w:i w:val="0"/>
           <w:sz w:val="22"/>
         </w:rPr>
-        <w:t>Swadeshi sentiment has evolved from a top-down government campaign into a genuinely consumer-driven movement that activates during three triggers: festive seasons (Diwali = buy Indian), geopolitical friction (US tariffs = boycott American, Pakistan tensions = boycott Chinese), and brand authenticity scandals (discovering global brands sell inferior versions in India). The movement is no longer dependent on government promotion - it has its own consumer momentum, particularly among Hindi-speaking urban consumers.</w:t>
+        <w:t>The assembly-vs-manufacturing distinction has become the single most effective counter-argument against Make in India claims. It is used by opposition politicians, media critics, and economically-literate consumers to deflate any manufacturing success story. Importantly, even consumers who support Make in India are increasingly aware of this distinction, creating cognitive dissonance: they want to believe India manufactures, but they know it mostly assembles. The 'value-chain escalator' argument (assembly today leads to components tomorrow) is present but less emotionally compelling than the immediate critique.</w:t>
       </w:r>
     </w:p>
     <w:p>
@@ -8628,7 +8648,7 @@
           <w:i w:val="0"/>
           <w:sz w:val="22"/>
         </w:rPr>
-        <w:t>There is a large, engaged consumer segment willing to pay attention to and act on 'Buy Indian' messaging, but their motivation is emotional (national pride, geopolitical anger) rather than rational (product comparison). This creates both opportunity (strong brand loyalty once earned) and risk (the same consumers will punish perceived inauthenticity - brands that claim 'Indian' but are actually assembled from Chinese components).</w:t>
+        <w:t>Every manufacturing milestone that cannot withstand the 'but is it really manufactured or just assembled?' test will face immediate narrative deflation. This creates a communications arms race where the definition of success keeps moving upward. Yesterday's win (assembly plant) is today's criticism (just assembly, not manufacturing).</w:t>
       </w:r>
     </w:p>
     <w:p>
@@ -8657,7 +8677,7 @@
           <w:i w:val="0"/>
           <w:sz w:val="22"/>
         </w:rPr>
-        <w:t>For Indian brands: lean into origin transparency - show the factory, name the city, feature the workers. For global brands operating in India: demonstrate genuine local value creation (local R&amp;D, domestic sourcing) rather than just local assembly. Festive-season and geopolitical-trigger marketing campaigns can leverage Swadeshi sentiment, but must be backed by verifiable Indian content.</w:t>
+        <w:t>Get ahead of the assembly critique by proactively publishing domestic content percentages and improvement trajectories. Instead of defending assembly as a stepping stone, show concrete milestones: 'Last year 15% domestic content, this year 25%, target 50% by 2028.' Make the value-chain escalator visible and measurable rather than theoretical.</w:t>
       </w:r>
     </w:p>
     <w:p>
@@ -8686,7 +8706,7 @@
           <w:i w:val="0"/>
           <w:sz w:val="22"/>
         </w:rPr>
-        <w:t>Track purchase conversion rates during Swadeshi sentiment spikes (festive seasons, geopolitical events) vs baseline periods. Measure whether stated intent to 'buy Indian' translates into actual purchase behavior change.</w:t>
+        <w:t>Track domestic content percentages in key PLI-beneficiary product categories over time. Survey consumers on whether they distinguish between assembly and manufacturing, and whether trajectory data (improving domestic content %) changes their perception.</w:t>
       </w:r>
     </w:p>
     <w:p>
@@ -8743,13 +8763,7 @@
           <w:color w:val="374151"/>
           <w:sz w:val="20"/>
         </w:rPr>
-        <w:t xml:space="preserve">"Bro if you follow </w:t>
-        <w:br/>
-        <w:t xml:space="preserve">Use Swadeshi </w:t>
-        <w:br/>
-        <w:t xml:space="preserve">Means stop making reals </w:t>
-        <w:br/>
-        <w:t>Because youtube is foreign"</w:t>
+        <w:t>"The same as india is strong partner and friend of Taiwan and they never wan china Taiwan imarges with war we have a problem at what base you claim over Taiwan and yet if yes for you then why not india bid for his own part has pak"</w:t>
       </w:r>
       <w:r>
         <w:rPr>
@@ -8775,7 +8789,7 @@
           <w:color w:val="374151"/>
           <w:sz w:val="20"/>
         </w:rPr>
-        <w:t>"@FI_InvestIndia Buying Indian Products are ok and agreed, that amounts to buying local. But most of the local Kirana stores are inefficient in pricing by design ( due to the retail margins, distributor, Super stockist, C&amp;amp;F etc etc ) , and we cannot blame a common man if they hunt for bargains"</w:t>
+        <w:t>"@WhitePillzONLY Our trade deficit with China and ASEAN is extremely large. Most goods exported to us from ASEAN countries are actually Chinese products; they are merely relabeled or undergo minor assembly. This practice will destroy our domestic market. We must impose tariffs on China and ASEAN."</w:t>
       </w:r>
       <w:r>
         <w:rPr>
@@ -8873,7 +8887,7 @@
           <w:color w:val="6B7280"/>
           <w:sz w:val="18"/>
         </w:rPr>
-        <w:t xml:space="preserve">  |  11.8% of Dataset</w:t>
+        <w:t xml:space="preserve">  |  12.0% of Dataset</w:t>
       </w:r>
       <w:r>
         <w:rPr>
@@ -9274,7 +9288,7 @@
           <w:color w:val="6B7280"/>
           <w:sz w:val="18"/>
         </w:rPr>
-        <w:t xml:space="preserve">  |  8.9% of Dataset</w:t>
+        <w:t xml:space="preserve">  |  9.3% of Dataset</w:t>
       </w:r>
       <w:r>
         <w:rPr>
@@ -9665,7 +9679,7 @@
           <w:color w:val="374151"/>
           <w:sz w:val="18"/>
         </w:rPr>
-        <w:t>51% (Moderate)</w:t>
+        <w:t>57% (Moderate)</w:t>
       </w:r>
       <w:r>
         <w:rPr>
@@ -9675,7 +9689,7 @@
           <w:color w:val="6B7280"/>
           <w:sz w:val="18"/>
         </w:rPr>
-        <w:t xml:space="preserve">  |  7.1% of Dataset</w:t>
+        <w:t xml:space="preserve">  |  7.5% of Dataset</w:t>
       </w:r>
       <w:r>
         <w:rPr>
@@ -10567,7 +10581,7 @@
           <w:i w:val="0"/>
           <w:sz w:val="22"/>
         </w:rPr>
-        <w:t>Automated collection across Instagram, Reddit, Twitter, Youtube. Engagement-minimum filters applied at collection time.</w:t>
+        <w:t>Data ingested from external sources across Instagram, Reddit, Twitter, Youtube. Original collection methodology unknown.</w:t>
       </w:r>
     </w:p>
     <w:p>
@@ -11433,7 +11447,7 @@
           <w:i w:val="0"/>
           <w:sz w:val="22"/>
         </w:rPr>
-        <w:t>Primary: India. Content selected and filtered for relevance to the India market context. Items originating from other geographies are retained where they contribute relevant consumer perspective (e.g., diaspora experiences, cross-market comparisons).</w:t>
+        <w:t>Primary market context: India. Content is collected using market-specific queries (brand names, regional terms, India-specific keywords) and filtered for topical relevance. However, no platform provides verified geolocation data. Geographic origin is inferred from context (language, currency references, retailer mentions, cultural markers) rather than verified. Audit of comparable studies found 2-3% of corpus items originate from non-target markets (e.g., US product listings, UK healthcare discussions) that pass topical relevance filters. Findings in this report describe conversations about the brand in the India market context, not verified conversations from India consumers.</w:t>
       </w:r>
     </w:p>
     <w:p>

</xml_diff>